<commit_message>
fix plotting font issue
</commit_message>
<xml_diff>
--- a/uploads/23cjddy/23cjddy_成绩信息汇总.docx
+++ b/uploads/23cjddy/23cjddy_成绩信息汇总.docx
@@ -73,7 +73,7 @@
           <w:rFonts w:ascii="SimSun" w:hAnsi="SimSun" w:eastAsia="SimSun"/>
           <w:sz w:val="21"/>
         </w:rPr>
-        <w:t>授课对象及合班情况：new test和test new ，共计38人</w:t>
+        <w:t>授课对象及合班情况：a和b，共计38人</w:t>
       </w:r>
     </w:p>
     <w:p>
@@ -433,7 +433,7 @@
           <w:rFonts w:ascii="SimSun" w:hAnsi="SimSun" w:eastAsia="SimSun"/>
           <w:sz w:val="21"/>
         </w:rPr>
-        <w:t>new test和test new 班的网络学习部分的成绩情况见表2。</w:t>
+        <w:t>a和b班的网络学习部分的成绩情况见表2。</w:t>
       </w:r>
     </w:p>
     <w:p>
@@ -1268,7 +1268,10 @@
           <w:rFonts w:ascii="SimSun" w:hAnsi="SimSun" w:eastAsia="SimSun"/>
           <w:sz w:val="21"/>
         </w:rPr>
-        <w:t>本课程共有38名学生参与，最高分99.4，最低分0.0，平均分80.15。从成绩分布来看，大多数学生表现良好。具体而言，90-100分区间的学生占比最高，达到63.16%，表明大部分学生能够掌握课程内容并取得优异成绩。40-50分、50-60分以及60-70分区间的学生数量较少，分别为1人、2人和3人，占总人数的比例分别为2.63%、5.26%和7.89%。值得注意的是，有3名学生得分在30-40分、40-50分及以上的区间，显示部分学生在学习过程中遇到了一定的挑战。另外，有3名学生在80-90分区间，占比7.89%。最低分区间（0-10分）的学生人数较多，共3人，占比7.89%。整体来看，尽管有个别学生表现不佳，但大部分学生的学习成果令人满意，课程目标基本达成。未来教学中，需关注低分学生的学习情况，提供必要的辅导和支持，以帮助所有学生都能充分发挥潜力。</w:t>
+        <w:t>本次课程总共有38名学生参与。根据成绩数据分析，最高分为99.4，最低分为0.0，平均分为80.15。成绩分布方面，主要集中在高分段。具体来看，0-10分区间的学生有3人，占比7.89%；40-50分区间的学生有1人，占比2.63%；50-60分区间的学生有2人，占比5.26%；60-70分区间的学生有3人，占比7.89%；70-80分区间的学生有2人，占比5.26%；80-90分区间的学生有3人，占比7.89%；而90-100分区间的学生则达到了24人，占比63.16%。</w:t>
+        <w:br/>
+        <w:br/>
+        <w:t>整体而言，大部分学生在本课程中的表现优异，特别是在高分段的表现尤为突出。仅有少数学生处于较低分段，需进一步关注其学习状态与方法。考虑到课程内容及教学安排，建议未来在教学过程中更加注重基础概念的巩固，同时提供更多的个性化辅导以帮助不同层次的学生取得更好的进步。</w:t>
       </w:r>
     </w:p>
     <w:p>
@@ -1295,7 +1298,7 @@
         </w:rPr>
         <w:t>本学期共进行了XX次实验，全部在万维考试系统上完成，由系统自动评分。</w:t>
         <w:br/>
-        <w:t>new test和test new 班的实验成绩情况见表3。</w:t>
+        <w:t>a和b班的实验成绩情况见表3。</w:t>
       </w:r>
     </w:p>
     <w:p>
@@ -2130,13 +2133,16 @@
           <w:rFonts w:ascii="SimSun" w:hAnsi="SimSun" w:eastAsia="SimSun"/>
           <w:sz w:val="21"/>
         </w:rPr>
-        <w:t>本报告旨在对课程实验成绩进行简要分析与总结。</w:t>
+        <w:t>本课程学生实验成绩分析报告</w:t>
         <w:br/>
         <w:br/>
-        <w:t>总共有38名学生参与了此次实验，最高成绩为100.0分，最低成绩为0.0分，平均成绩为85.51分。成绩分布显示，绝大多数学生表现优异。具体来看，仅3名学生的成绩在0至10分之间，占总人数的7.89%；其余成绩均集中在高分段，其中81.58%的学生获得了90至100分，另有7.89%的学生取得了80至90分的成绩。值得注意的是，仅有1名学生获得70至80分之间的成绩。</w:t>
+        <w:t>总人数：38人。最高分100.0，最低分0.0，平均分85.51。</w:t>
         <w:br/>
         <w:br/>
-        <w:t>整体而言，大部分学生展现了良好的理解与应用能力，达到了预期的学习目标。对于少数成绩较低的学生，建议关注其学习过程中可能存在的问题，并提供相应的辅导与支持，以帮助他们提升成绩。未来教学中，可考虑增加更多实践机会，进一步巩固学生的基础知识，提高整体学习效果。</w:t>
+        <w:t>成绩分布情况：0-10分有3人，占比7.89%；70-80分有1人，占比2.63%；80-90分有3人，占比7.89%；90-100分有31人，占比81.58%。10-20分、20-30分、30-40分、40-50分、50-60分、60-70分、80-90分各段无学生得分。</w:t>
+        <w:br/>
+        <w:br/>
+        <w:t>分析：本次实验成绩整体较高，大部分学生表现出色，成绩集中在90-100分之间，占比高达81.58%。仅少数学生未能达到预期水平，成绩在10分以下，占比7.89%。值得注意的是，中间分数段（70-80分、80-90分）的学生数量较少，表明学生成绩两极分化较为明显。下一步教学应关注提升中低分段学生的表现，缩小成绩差距，确保所有学生都能掌握课程内容并取得良好成绩。</w:t>
       </w:r>
     </w:p>
     <w:p>
@@ -2193,7 +2199,7 @@
         </w:rPr>
         <w:t>从试题内容来看，试卷基本能覆盖教学大纲中的实践操作内容，能较好地考察学生的掌握情况，也能较真实地反映学生的计算机应用水平。</w:t>
         <w:br/>
-        <w:t>new test和test new 班的期末考试成绩情况见表4。</w:t>
+        <w:t>a和b班的期末考试成绩情况见表4。</w:t>
       </w:r>
     </w:p>
     <w:p>
@@ -3028,16 +3034,16 @@
           <w:rFonts w:ascii="SimSun" w:hAnsi="SimSun" w:eastAsia="SimSun"/>
           <w:sz w:val="21"/>
         </w:rPr>
-        <w:t>本报告旨在对某课程期末成绩进行总结与分析。</w:t>
+        <w:t>本报告旨在对当前学期所授课程的学生期末成绩进行简要总结与分析。</w:t>
         <w:br/>
         <w:br/>
-        <w:t>总共有38名学生参与了该课程的学习与考核，成绩范围从最低的45.2分到最高的98.6分。整体平均分为74.36分。</w:t>
+        <w:t>全班共38名学生参与期末考试，成绩区间从最低的45.2分到最高的98.6分，平均分达到74.36分。从分数分布来看，成绩呈现一定的正偏态分布，多数学生集中在60至90分之间。具体而言，40-50分及50-60分段各有3人，占总人数比例均为7.89%。60-70分段有11人，占比28.95%，成为人数最多的区间。70-80分段和80-90分段各有3人和10人，占比分别为7.89%和26.32%。90-100分段则有8人，占比21.05%。</w:t>
         <w:br/>
         <w:br/>
-        <w:t>成绩分布方面，可以观察到成绩呈现出较为集中的趋势。具体而言，有7.89%的学生得分在40至50分之间，同样比例的学生（7.89%）得分在50至60分之间。60至70分这一区间的学生占比相对较高，达到28.95%。70至80分以及80至90分区间的学生分别占总人数的7.89%和26.32%。值得注意的是，高分段（90至100分）的学生占总人数的比例也达到了21.05%，显示出相当一部分学生掌握了课程的核心内容并取得了优异的成绩。</w:t>
+        <w:t>整体而言，大部分学生表现出色，接近或超过平均分水平，显示了较好的学习效果和理解能力。然而，也有部分学生未能达到预期标准，特别是位于40-50分和50-60分段的学生，需要进一步关注和辅导以提高其学业成绩。</w:t>
         <w:br/>
         <w:br/>
-        <w:t>基于上述数据，可以看出该课程的教学目标在很大程度上得到了实现，多数学生能够掌握课程内容，并且有一部分学生表现出色。未来可考虑在保持现有教学方法的基础上，加强对中低分段学生的支持与辅导，进一步提升整体教学质量。</w:t>
+        <w:t>未来教学过程中，将针对不同层次的学生采取差异化教学策略，强化基础知识教学的同时，注重提升高分段学生的综合应用能力和创新思维。</w:t>
       </w:r>
     </w:p>
     <w:p>
@@ -3062,7 +3068,7 @@
           <w:rFonts w:ascii="SimSun" w:hAnsi="SimSun" w:eastAsia="SimSun"/>
           <w:sz w:val="21"/>
         </w:rPr>
-        <w:t>new test和test new 班的课程总评成绩情况见表5。</w:t>
+        <w:t>a和b班的课程总评成绩情况见表5。</w:t>
       </w:r>
     </w:p>
     <w:p>
@@ -3897,16 +3903,13 @@
           <w:rFonts w:ascii="SimSun" w:hAnsi="SimSun" w:eastAsia="SimSun"/>
           <w:sz w:val="21"/>
         </w:rPr>
-        <w:t>本课程共有38名学生参与学习。总体来看，学生表现良好，成绩分布合理。最高分为98分，最低分为28分，平均分达到77.71分。</w:t>
+        <w:t>本报告旨在对本学期所授课程的学生总评成绩进行简要总结与分析。</w:t>
         <w:br/>
         <w:br/>
-        <w:t>成绩在80-90分之间的学生最多，占总人数的34.21%，表明大部分学生对课程内容掌握较好，能够较好地完成各项任务。紧随其后的是90-100分区间的学生，占比21.05%，显示有一部分学生对课程内容有深入理解和掌握。60-70分和70-80分这两个区间的学生分别占比13.16%和23.68%，说明多数学生达到了课程的基本要求，并且有一定水平的表现。</w:t>
+        <w:t>课程总共有38名学生参与。最高成绩为98分，最低成绩为28分，平均成绩为77.71分。成绩分布显示，大部分学生集中在较高分数段。具体而言，20-30分段仅有一人，占比2.63%；30-40分段有两人，占比5.26%。而60-70分段有五人，占比13.16%；70-80分段九人，占比23.68%。成绩在80-90分段的学生最多，共13人，占比34.21%；90-100分段的学生也有八人，占比21.05%。这些数据表明，大多数学生对课程内容掌握较好，能够取得较高的成绩。</w:t>
         <w:br/>
         <w:br/>
-        <w:t>值得注意的是，20-30分区间内仅有一名学生，占比2.63%。这一成绩区间的学生较少，可能反映了课程难度与大多数学生的适应性较为匹配。然而，最低分为28分，表明仍有一部分学生在课程学习过程中遇到了困难，需要进一步的支持和指导。</w:t>
-        <w:br/>
-        <w:br/>
-        <w:t>综上，该课程整体上取得了积极的教学效果，但也有提升空间，特别是对于成绩较低的学生群体，应考虑采取措施提供更多的辅导和支持。</w:t>
+        <w:t>总体来看，本课程的教学目标基本达成，多数学生能够理解和应用所学知识，表现出良好的学习态度和能力。未来教学中可考虑进一步提升教学方法，以满足不同层次学生的学习需求，确保每位学生都能得到相应的指导和支持，从而进一步提高整体教学质量和效果。</w:t>
       </w:r>
     </w:p>
     <w:p>
@@ -3946,37 +3949,37 @@
         <w:t xml:space="preserve"> 课程效果分析报告</w:t>
         <w:br/>
         <w:br/>
-        <w:t xml:space="preserve"> 一、学生课程基础的掌握情况</w:t>
+        <w:t xml:space="preserve"> 一、学生课程基础掌握情况</w:t>
         <w:br/>
         <w:br/>
-        <w:t>在学习本课程之前，大多数学生已经具备了较为扎实的基础知识。这些基础知识涵盖了相关领域的基本概念、理论框架及部分实际应用。然而，仍有部分学生的基础知识相对薄弱，这在一定程度上影响了他们对新知识的理解与吸收。</w:t>
+        <w:t>在本课程开始之前，大部分学生已经具备了必要的预备知识，这为他们理解和吸收新知识提供了良好的基础。然而，仍有一部分学生的基础相对薄弱，需要更多的辅导和支持以确保他们能够跟上课程进度。</w:t>
         <w:br/>
         <w:br/>
-        <w:t xml:space="preserve"> 二、学生的学习态度</w:t>
+        <w:t xml:space="preserve"> 二、学生学习态度</w:t>
         <w:br/>
         <w:br/>
-        <w:t>总体而言，学生们在学习过程中表现出了积极的态度。大部分学生能够主动参与课堂讨论，积极提出问题并寻求解答。这种主动学习的态度有助于提高学习效率和深度理解课程内容。不过，也有少数学生表现出一定的被动性，需要教师更多的引导和鼓励。</w:t>
+        <w:t>学生在学习过程中表现出了较高的积极性，特别是在参与课堂讨论和提出问题方面。大多数学生能够主动寻求帮助，并积极参与课堂活动，显示出良好的学习态度。但也存在少数学生在参与度上稍显不足，需进一步激励。</w:t>
         <w:br/>
         <w:br/>
         <w:t xml:space="preserve"> 三、课时安排对教学效果的影响</w:t>
         <w:br/>
         <w:br/>
-        <w:t>合理的课时安排对于提升教学效果至关重要。当前的课时分配较为均衡，既保证了理论知识的讲解，也留有足够的时间用于实践操作和案例分析。然而，在某些章节中，由于内容较为复杂，课时显得略显紧张，可能会影响到学生对难点知识的深入理解和掌握。</w:t>
+        <w:t>总体而言，当前的课时安排合理，能够满足学生的学习需求。然而，在某些复杂概念的教学上，适当延长授课时间或增加复习课时，可能会对学生理解掌握这些知识点产生积极影响。</w:t>
         <w:br/>
         <w:br/>
         <w:t xml:space="preserve"> 四、教学方式对教学效果的影响</w:t>
         <w:br/>
         <w:br/>
-        <w:t>采用多样化的教学方法，如案例教学、小组讨论、项目实践等，有效地激发了学生的学习兴趣，促进了知识的理解与应用。特别是通过实践活动，学生能够将理论知识与实际情况相结合，加深了对知识点的记忆和理解。但值得注意的是，部分教学方法的应用范围和频率需要根据学生的反馈进行适当调整，以更好地满足不同学生的学习需求。</w:t>
+        <w:t>采用多样化的教学方法，包括讲授、小组讨论、案例研究等，有助于提高学生的学习兴趣和参与度。特别是通过小组合作的方式，不仅促进了学生之间的交流与合作，也提高了他们的实际操作能力。但需要注意的是，应根据课程内容和学生特点灵活调整教学策略。</w:t>
         <w:br/>
         <w:br/>
         <w:t xml:space="preserve"> 五、教学内容对教学效果的影响</w:t>
         <w:br/>
         <w:br/>
-        <w:t>教学内容的选择与编排直接影响到教学效果。本课程的教学内容紧贴行业发展趋势，涵盖了广泛且实用的知识点，为学生提供了全面的专业技能训练。同时，通过引入最新的研究成果和技术动态，激发了学生探索未知的兴趣。然而，部分内容的难度设置存在差异，部分高级或前沿的内容可能对基础较弱的学生构成挑战，需要进一步优化内容结构，确保所有学生都能跟上教学进度。</w:t>
+        <w:t>教学内容的设计紧密围绕课程目标展开，覆盖了必要的理论知识与实践技能。然而，在部分内容的选择上，考虑到学生的不同背景和兴趣点，适当引入更多贴近实际应用的例子或项目，将更有利于提升学生的学习动机和满意度。</w:t>
         <w:br/>
         <w:br/>
-        <w:t>综上所述，尽管在某些方面还存在改进空间，但整体来看，本课程的教学设计和实施已取得了较好的效果。未来可考虑结合上述分析，针对性地调整和完善教学策略，以进一步提升教学质量。</w:t>
+        <w:t>综上所述，虽然本课程在多个方面取得了显著成效，但仍存在一些可改进的空间。通过不断优化教学策略、调整课程内容以及增强师生互动，有望进一步提升整体教学质量和学生的学习体验。</w:t>
       </w:r>
     </w:p>
     <w:p>
@@ -4001,31 +4004,28 @@
           <w:rFonts w:ascii="SimSun" w:hAnsi="SimSun" w:eastAsia="SimSun"/>
           <w:sz w:val="21"/>
         </w:rPr>
-        <w:t>在对本课程进行全面审视的基础上，我们提出以下几点改进建议与措施，旨在优化教学效果，提升学生体验：</w:t>
+        <w:t>在对本课程进行全面审视后，我们提出以下几点改进建议，旨在提升教学质量和学习体验。</w:t>
         <w:br/>
         <w:br/>
-        <w:t>1. 增强互动性：通过引入更多互动环节，如在线讨论、小组项目等，激发学生的参与热情，促进知识的深入理解和应用。</w:t>
+        <w:t>1. 增强互动性：增加课堂内外的互动环节，如小组讨论、在线论坛交流等，以促进学生之间的交流与合作。这不仅能够激发学生的参与感，还能提高他们对课程内容的理解和记忆。</w:t>
         <w:br/>
         <w:br/>
-        <w:t>2. 多样化教学方法：结合线上与线下资源，采用案例研究、角色扮演等多种教学方式，以适应不同学习者的需求和偏好，提高教学效果。</w:t>
+        <w:t>2. 丰富教学资源：提供多样化的学习材料，包括但不限于视频讲座、案例研究、阅读文献等，以满足不同学习风格的学生需求。同时，确保这些资源的更新频率和质量，保持其时效性和实用性。</w:t>
         <w:br/>
         <w:br/>
-        <w:t>3. 强化实践环节：增加实际操作机会，比如实习、实验室工作或模拟项目，让学生在实践中掌握理论知识，增强解决实际问题的能力。</w:t>
+        <w:t>3. 强化实践环节：加强理论与实践相结合的部分，通过项目作业、实习实训等形式让学生有机会将所学知识应用于实际问题解决中，从而加深理解和掌握程度。</w:t>
         <w:br/>
         <w:br/>
-        <w:t>4. 个性化学习路径：利用技术手段提供个性化学习建议，根据学生的学习进度和兴趣定制课程内容，满足个体化需求。</w:t>
+        <w:t>4. 优化评估体系：建立更加全面和多元化的评价机制，除了传统的考试成绩外，还应考虑平时表现、团队协作能力、创新思维等多个维度进行综合评价，以便更准确地反映学生的学习成效和个人发展情况。</w:t>
         <w:br/>
         <w:br/>
-        <w:t>5. 加强教师培训：定期组织教师参加专业发展培训，提升其教学技巧与内容更新能力，确保教学质量与时俱进。</w:t>
+        <w:t>5. 个性化辅导支持：为需要额外帮助的学生提供个性化的指导和支持服务，比如设立辅导时间、开展补习班等，确保每位学生都能获得适合自己的学习路径和发展机会。</w:t>
         <w:br/>
         <w:br/>
-        <w:t>6. 改善反馈机制：建立更加及时有效的反馈渠道，鼓励学生提出意见和建议，并据此调整教学计划，形成良性循环。</w:t>
+        <w:t>6. 反馈机制建设：建立健全的反馈系统，鼓励师生之间以及学生之间的开放沟通。定期收集并分析来自各方的意见和建议，及时调整教学策略，以持续改进课程设计和实施效果。</w:t>
         <w:br/>
         <w:br/>
-        <w:t>7. 拓宽国际视野：引入国际化教育资源，如海外合作院校课程模块、国际专家讲座等，帮助学生开阔视野，培养全球竞争力。</w:t>
-        <w:br/>
-        <w:br/>
-        <w:t>这些建议旨在从多个维度出发，全面提升课程质量，为学生创造更优质的教育环境。</w:t>
+        <w:t>以上措施旨在从多个角度出发，全面提升课程的教学质量和学生的学习体验。希望这些提议能够为未来的课程发展提供有益参考。</w:t>
       </w:r>
     </w:p>
     <w:sectPr>

</xml_diff>

<commit_message>
report style bug fixed
</commit_message>
<xml_diff>
--- a/uploads/23cjddy/23cjddy_成绩信息汇总.docx
+++ b/uploads/23cjddy/23cjddy_成绩信息汇总.docx
@@ -13,18 +13,6 @@
           <w:sz w:val="36"/>
         </w:rPr>
         <w:t>课程反思报告</w:t>
-      </w:r>
-    </w:p>
-    <w:p>
-      <w:pPr>
-        <w:jc w:val="center"/>
-      </w:pPr>
-      <w:r>
-        <w:rPr>
-          <w:rFonts w:ascii="Times New Roman" w:hAnsi="Times New Roman"/>
-          <w:sz w:val="21"/>
-        </w:rPr>
-        <w:t>(2023-2024学年第1学期)</w:t>
       </w:r>
     </w:p>
     <w:p>
@@ -73,7 +61,7 @@
           <w:rFonts w:ascii="SimSun" w:hAnsi="SimSun" w:eastAsia="SimSun"/>
           <w:sz w:val="21"/>
         </w:rPr>
-        <w:t>授课对象及合班情况：a和b，共计38人</w:t>
+        <w:t>授课对象及合班情况：test和tst，共计38人</w:t>
       </w:r>
     </w:p>
     <w:p>
@@ -433,7 +421,7 @@
           <w:rFonts w:ascii="SimSun" w:hAnsi="SimSun" w:eastAsia="SimSun"/>
           <w:sz w:val="21"/>
         </w:rPr>
-        <w:t>a和b班的网络学习部分的成绩情况见表2。</w:t>
+        <w:t>test和tst班的网络学习部分的成绩情况见表2。</w:t>
       </w:r>
     </w:p>
     <w:p>
@@ -1268,10 +1256,55 @@
           <w:rFonts w:ascii="SimSun" w:hAnsi="SimSun" w:eastAsia="SimSun"/>
           <w:sz w:val="21"/>
         </w:rPr>
-        <w:t>本次课程总共有38名学生参与。根据成绩数据分析，最高分为99.4，最低分为0.0，平均分为80.15。成绩分布方面，主要集中在高分段。具体来看，0-10分区间的学生有3人，占比7.89%；40-50分区间的学生有1人，占比2.63%；50-60分区间的学生有2人，占比5.26%；60-70分区间的学生有3人，占比7.89%；70-80分区间的学生有2人，占比5.26%；80-90分区间的学生有3人，占比7.89%；而90-100分区间的学生则达到了24人，占比63.16%。</w:t>
+        <w:t>### 课程成绩分析报告</w:t>
         <w:br/>
         <w:br/>
-        <w:t>整体而言，大部分学生在本课程中的表现优异，特别是在高分段的表现尤为突出。仅有少数学生处于较低分段，需进一步关注其学习状态与方法。考虑到课程内容及教学安排，建议未来在教学过程中更加注重基础概念的巩固，同时提供更多的个性化辅导以帮助不同层次的学生取得更好的进步。</w:t>
+        <w:t>本报告旨在对某门课程学生的平时成绩进行全面分析，通过详细的数据和具体案例，探讨成绩分布背后的因素。</w:t>
+        <w:br/>
+        <w:br/>
+        <w:t>#### 成绩概况</w:t>
+        <w:br/>
+        <w:br/>
+        <w:t>该课程共有38名学生参与，最高分为99.4分，最低分为0分，平均分为80.15分。从成绩分布来看，40-50分区间有1人，占比2.63%；50-60分区间有2人，占比5.26%；60-70分区间有3人，占比7.89%；70-80分区间有2人，占比5.26%；80-90分区间有3人，占比7.89%；而90-100分区间有24人，占比高达63.16%。</w:t>
+        <w:br/>
+        <w:br/>
+        <w:t>值得注意的是，0-10分区间有3人，占比7.89%，这些成绩较低的学生需要特别关注。另外，10-20分、20-30分、30-40分区间均无学生得分，表明这部分区间的学生表现较为一致，没有出现分数落差较大的情况。</w:t>
+        <w:br/>
+        <w:br/>
+        <w:t>#### 成绩分布原因分析</w:t>
+        <w:br/>
+        <w:br/>
+        <w:t>**教学方法**</w:t>
+        <w:br/>
+        <w:br/>
+        <w:t>在教学过程中，我们采用了多样化的教学方法，包括小组讨论、案例分析、项目实践等。这些方法有助于激发学生的学习兴趣，促进知识的理解与应用。然而，这也可能导致部分学生感到压力较大，尤其是在项目实践环节中，一些学生可能因为时间管理不当或团队合作不佳而受到影响，从而导致成绩偏低。</w:t>
+        <w:br/>
+        <w:br/>
+        <w:t>**学生参与度**</w:t>
+        <w:br/>
+        <w:br/>
+        <w:t>整体来看，学生的参与度较高，特别是在课堂互动环节，大多数学生都能积极参与讨论，提出自己的见解。但是，也存在一些学生在课堂上表现不够积极的情况，这可能与个人性格特点有关。此外，个别学生由于家庭或其他外部因素影响，未能全身心投入学习，这也可能是其成绩偏低的一个原因。</w:t>
+        <w:br/>
+        <w:br/>
+        <w:t>**课程难度**</w:t>
+        <w:br/>
+        <w:br/>
+        <w:t>从总体成绩分布来看，大部分学生能够较好地掌握课程内容，尤其是高分段学生占比较大，反映出课程难度相对适中。但也有少部分学生在某些知识点上遇到了困难，特别是那些在0-40分区间的学生，他们可能在理解某些概念或完成特定任务时遇到了障碍。</w:t>
+        <w:br/>
+        <w:br/>
+        <w:t>#### 具体案例分析</w:t>
+        <w:br/>
+        <w:br/>
+        <w:t>以0-10分区间内的学生为例，其中一位学生A在每次作业提交后都表现出明显的焦虑情绪，经常向教师寻求帮助，但在课堂上的表现却不尽如人意。通过与学生A的沟通了解到，他在家中的学习环境较差，缺乏必要的学习资源和支持，这严重影响了他的学习效果。针对这种情况，我们建议学校可以为有需要的学生提供额外的学习辅导和心理支持服务。</w:t>
+        <w:br/>
+        <w:br/>
+        <w:t>另一位学生B则是因为家庭原因，父母长期在外工作，缺少有效的监督和指导，导致其学习成绩下滑。为了帮助这类学生，建议学校加强家校联系，及时了解学生在家中的学习状况，并给予适当的干预措施。</w:t>
+        <w:br/>
+        <w:br/>
+        <w:t>#### 结论</w:t>
+        <w:br/>
+        <w:br/>
+        <w:t>通过对成绩分布的分析可以看出，大部分学生在本课程中的表现良好，但仍存在一定比例的学生面临挑战。未来，我们需要继续优化教学方法，提高学生参与度，并针对不同学生的需求提供个性化支持，以帮助所有学生取得更好的成绩。同时，也要加强对学生心理状态的关注，营造良好的学习氛围，促进学生的全面发展。</w:t>
       </w:r>
     </w:p>
     <w:p>
@@ -1298,7 +1331,7 @@
         </w:rPr>
         <w:t>本学期共进行了XX次实验，全部在万维考试系统上完成，由系统自动评分。</w:t>
         <w:br/>
-        <w:t>a和b班的实验成绩情况见表3。</w:t>
+        <w:t>test和tst班的实验成绩情况见表3。</w:t>
       </w:r>
     </w:p>
     <w:p>
@@ -2133,16 +2166,77 @@
           <w:rFonts w:ascii="SimSun" w:hAnsi="SimSun" w:eastAsia="SimSun"/>
           <w:sz w:val="21"/>
         </w:rPr>
-        <w:t>本课程学生实验成绩分析报告</w:t>
+        <w:t>### 课程实验成绩总结与分析报告</w:t>
         <w:br/>
         <w:br/>
-        <w:t>总人数：38人。最高分100.0，最低分0.0，平均分85.51。</w:t>
+        <w:t>本报告旨在详细分析一门课程实验的成绩分布情况及其背后的原因。通过对成绩数据的细致观察和分析，希望能够为未来的教学改进提供参考。</w:t>
         <w:br/>
         <w:br/>
-        <w:t>成绩分布情况：0-10分有3人，占比7.89%；70-80分有1人，占比2.63%；80-90分有3人，占比7.89%；90-100分有31人，占比81.58%。10-20分、20-30分、30-40分、40-50分、50-60分、60-70分、80-90分各段无学生得分。</w:t>
+        <w:t>#### 成绩分布概述</w:t>
         <w:br/>
         <w:br/>
-        <w:t>分析：本次实验成绩整体较高，大部分学生表现出色，成绩集中在90-100分之间，占比高达81.58%。仅少数学生未能达到预期水平，成绩在10分以下，占比7.89%。值得注意的是，中间分数段（70-80分、80-90分）的学生数量较少，表明学生成绩两极分化较为明显。下一步教学应关注提升中低分段学生的表现，缩小成绩差距，确保所有学生都能掌握课程内容并取得良好成绩。</w:t>
+        <w:t>本课程共有38名学生参与实验，成绩范围从0分到100分，平均成绩为85.51分。成绩分布呈现明显的右偏趋势，大部分学生的成绩集中在高分段。</w:t>
+        <w:br/>
+        <w:br/>
+        <w:t>- **0-10分**：有3名学生，占比7.89%。</w:t>
+        <w:br/>
+        <w:t>- **10-20分**至**30-40分**：各段均无学生。</w:t>
+        <w:br/>
+        <w:t>- **40-50分**至**60-70分**：也未出现任何学生。</w:t>
+        <w:br/>
+        <w:t>- **70-80分**：仅1名学生，占比2.63%。</w:t>
+        <w:br/>
+        <w:t>- **80-90分**：有3名学生，占比7.89%。</w:t>
+        <w:br/>
+        <w:t>- **90-100分**：31名学生，占比81.58%。</w:t>
+        <w:br/>
+        <w:br/>
+        <w:t>从上述数据可以看出，高分段的学生占据了绝大多数，而低分段几乎无人问津。这种分布趋势表明，大部分学生对课程内容掌握良好，实验操作水平较高。</w:t>
+        <w:br/>
+        <w:br/>
+        <w:t>#### 成绩分布原因分析</w:t>
+        <w:br/>
+        <w:br/>
+        <w:t>##### 教学方法</w:t>
+        <w:br/>
+        <w:br/>
+        <w:t>1. **互动式教学**：课堂上我们采用了大量的互动式教学方法，通过小组讨论、案例分析等多种形式加强学生对知识点的理解和应用能力。</w:t>
+        <w:br/>
+        <w:t xml:space="preserve">   </w:t>
+        <w:br/>
+        <w:t>2. **实践导向**：实验设计注重与理论知识的紧密结合，使学生能够在实际操作中加深理解，提高解决问题的能力。</w:t>
+        <w:br/>
+        <w:br/>
+        <w:t>##### 学生参与度</w:t>
+        <w:br/>
+        <w:br/>
+        <w:t>1. **积极性高**：大多数学生在课内外表现出较高的学习积极性，主动查阅资料、参与讨论，形成了良好的学习氛围。</w:t>
+        <w:br/>
+        <w:t xml:space="preserve">   </w:t>
+        <w:br/>
+        <w:t>2. **团队合作**：小组项目鼓励了学生之间的合作交流，促进了知识共享和互补，增强了团队协作能力。</w:t>
+        <w:br/>
+        <w:br/>
+        <w:t>##### 课程难度</w:t>
+        <w:br/>
+        <w:br/>
+        <w:t>1. **适中难度**：整体来看，课程设置的难度较为适中，既不过于简单导致学生缺乏挑战性，也不至于过分复杂使学生望而却步。</w:t>
+        <w:br/>
+        <w:t xml:space="preserve">   </w:t>
+        <w:br/>
+        <w:t>2. **逐步递进**：课程内容由浅入深、循序渐进地展开，帮助学生逐步建立起扎实的知识基础。</w:t>
+        <w:br/>
+        <w:br/>
+        <w:t>#### 具体案例分析</w:t>
+        <w:br/>
+        <w:br/>
+        <w:t>以一名获得满分的学生为例，该同学平时积极参与课堂讨论，善于将理论知识与实际应用相结合，遇到问题能够及时寻求帮助并积极解决。此外，他还在课外时间投入大量精力复习巩固所学内容，最终取得了优异成绩。</w:t>
+        <w:br/>
+        <w:br/>
+        <w:t>#### 结论与建议</w:t>
+        <w:br/>
+        <w:br/>
+        <w:t>总体而言，本次课程实验成绩反映了大部分学生具备较强的学习能力和较高的实验操作水平。然而，对于少数未能取得理想成绩的学生，建议未来可以进一步优化教学方法，增加个性化辅导，帮助他们克服困难，提升整体表现。同时，继续维持现有的积极学习氛围，鼓励更多学生参与到课堂活动中来，共同促进教学质量的提升。</w:t>
       </w:r>
     </w:p>
     <w:p>
@@ -2199,7 +2293,7 @@
         </w:rPr>
         <w:t>从试题内容来看，试卷基本能覆盖教学大纲中的实践操作内容，能较好地考察学生的掌握情况，也能较真实地反映学生的计算机应用水平。</w:t>
         <w:br/>
-        <w:t>a和b班的期末考试成绩情况见表4。</w:t>
+        <w:t>test和tst班的期末考试成绩情况见表4。</w:t>
       </w:r>
     </w:p>
     <w:p>
@@ -3034,16 +3128,59 @@
           <w:rFonts w:ascii="SimSun" w:hAnsi="SimSun" w:eastAsia="SimSun"/>
           <w:sz w:val="21"/>
         </w:rPr>
-        <w:t>本报告旨在对当前学期所授课程的学生期末成绩进行简要总结与分析。</w:t>
+        <w:t>### 课程成绩分析报告</w:t>
         <w:br/>
         <w:br/>
-        <w:t>全班共38名学生参与期末考试，成绩区间从最低的45.2分到最高的98.6分，平均分达到74.36分。从分数分布来看，成绩呈现一定的正偏态分布，多数学生集中在60至90分之间。具体而言，40-50分及50-60分段各有3人，占总人数比例均为7.89%。60-70分段有11人，占比28.95%，成为人数最多的区间。70-80分段和80-90分段各有3人和10人，占比分别为7.89%和26.32%。90-100分段则有8人，占比21.05%。</w:t>
+        <w:t>本课程共有38名学生参加期末考试。根据成绩统计，最高的分数是98.6分，最低的分数是45.2分，平均分数为74.36分。基于这些数据，可以看到成绩分布较为分散，从不及格到接近满分都有分布。</w:t>
         <w:br/>
         <w:br/>
-        <w:t>整体而言，大部分学生表现出色，接近或超过平均分水平，显示了较好的学习效果和理解能力。然而，也有部分学生未能达到预期标准，特别是位于40-50分和50-60分段的学生，需要进一步关注和辅导以提高其学业成绩。</w:t>
+        <w:t>#### 各分数段的分布情况</w:t>
         <w:br/>
         <w:br/>
-        <w:t>未来教学过程中，将针对不同层次的学生采取差异化教学策略，强化基础知识教学的同时，注重提升高分段学生的综合应用能力和创新思维。</w:t>
+        <w:t>- **0-10分**：没有学生落在这个区间。</w:t>
+        <w:br/>
+        <w:t>- **10-20分**：没有学生落在这个区间。</w:t>
+        <w:br/>
+        <w:t>- **20-30分**：没有学生落在这个区间。</w:t>
+        <w:br/>
+        <w:t>- **30-40分**：没有学生落在这个区间。</w:t>
+        <w:br/>
+        <w:t>- **40-50分**：有3名学生，占比7.89%。</w:t>
+        <w:br/>
+        <w:t>- **50-60分**：有3名学生，占比7.89%。</w:t>
+        <w:br/>
+        <w:t>- **60-70分**：有11名学生，占比28.95%。</w:t>
+        <w:br/>
+        <w:t>- **70-80分**：有3名学生，占比7.89%。</w:t>
+        <w:br/>
+        <w:t>- **80-90分**：有10名学生，占比26.32%。</w:t>
+        <w:br/>
+        <w:t>- **90-100分**：有8名学生，占比21.05%。</w:t>
+        <w:br/>
+        <w:br/>
+        <w:t>可以看到，成绩在60-70分和80-90分两个区间的学生最多，分别占比28.95%和26.32%，而高分段(90-100分)和低分段(40-50分)的学生数量相对较少，分别为21.05%和7.89%。</w:t>
+        <w:br/>
+        <w:br/>
+        <w:t>#### 成绩分布原因分析</w:t>
+        <w:br/>
+        <w:br/>
+        <w:t>1. **课程难度与教学方法**：课程设计涵盖了理论知识与实践应用两方面，旨在培养学生的综合能力。尽管如此，部分学生在理解某些复杂概念时遇到了困难，导致成绩偏低。为了改善这一状况，未来可引入更多实际案例分析，提高学生的理解和应用能力。</w:t>
+        <w:br/>
+        <w:t xml:space="preserve">   </w:t>
+        <w:br/>
+        <w:t>2. **学生参与度**：从成绩分布来看，大多数学生能够较好地掌握课程内容并取得良好成绩。然而，也有部分学生由于参与度不高，在考试中表现不佳。增加课堂互动环节，鼓励学生积极参与讨论和提问，可以有效提升整体学习效果。例如，在一次关于项目管理的课堂讨论中，一位平时成绩平平的同学通过积极发言获得了额外加分，这表明参与度对成绩有直接影响。</w:t>
+        <w:br/>
+        <w:br/>
+        <w:t>3. **课外辅导与自我复习**：部分高分学生表示他们利用课余时间进行了额外复习，并参加了辅导班。因此，建议学校提供更多课外辅导资源，帮助那些需要额外支持的学生。</w:t>
+        <w:br/>
+        <w:br/>
+        <w:t>4. **评估方式**：期末考试虽然全面考察了学生的学习成果，但单一的考核形式可能导致一些擅长实践操作但在笔试中表现不佳的学生受到影响。未来可以考虑采用更加多元化的评价体系，如增加平时成绩占比或引入项目作业等。</w:t>
+        <w:br/>
+        <w:br/>
+        <w:t>#### 结论</w:t>
+        <w:br/>
+        <w:br/>
+        <w:t>总体而言，本课程大部分学生能够较好地完成学习任务，但也存在一部分学生成绩偏低的问题。通过对教学方法、学生参与度以及评估方式等方面的改进，相信可以进一步提升教学质量，帮助所有学生取得更好的成绩。</w:t>
       </w:r>
     </w:p>
     <w:p>
@@ -3068,7 +3205,7 @@
           <w:rFonts w:ascii="SimSun" w:hAnsi="SimSun" w:eastAsia="SimSun"/>
           <w:sz w:val="21"/>
         </w:rPr>
-        <w:t>a和b班的课程总评成绩情况见表5。</w:t>
+        <w:t>test和tst班的课程总评成绩情况见表5。</w:t>
       </w:r>
     </w:p>
     <w:p>
@@ -3903,13 +4040,79 @@
           <w:rFonts w:ascii="SimSun" w:hAnsi="SimSun" w:eastAsia="SimSun"/>
           <w:sz w:val="21"/>
         </w:rPr>
-        <w:t>本报告旨在对本学期所授课程的学生总评成绩进行简要总结与分析。</w:t>
+        <w:t>### 课程总结报告</w:t>
         <w:br/>
         <w:br/>
-        <w:t>课程总共有38名学生参与。最高成绩为98分，最低成绩为28分，平均成绩为77.71分。成绩分布显示，大部分学生集中在较高分数段。具体而言，20-30分段仅有一人，占比2.63%；30-40分段有两人，占比5.26%。而60-70分段有五人，占比13.16%；70-80分段九人，占比23.68%。成绩在80-90分段的学生最多，共13人，占比34.21%；90-100分段的学生也有八人，占比21.05%。这些数据表明，大多数学生对课程内容掌握较好，能够取得较高的成绩。</w:t>
+        <w:t>#### 成绩分布情况</w:t>
         <w:br/>
         <w:br/>
-        <w:t>总体来看，本课程的教学目标基本达成，多数学生能够理解和应用所学知识，表现出良好的学习态度和能力。未来教学中可考虑进一步提升教学方法，以满足不同层次学生的学习需求，确保每位学生都能得到相应的指导和支持，从而进一步提高整体教学质量和效果。</w:t>
+        <w:t>在本次课程中，共有38名学生参与，最高分为98分，最低分为28分，平均分为77.71分。根据分数段统计，成绩分布如下：</w:t>
+        <w:br/>
+        <w:br/>
+        <w:t>- **0-10分**：无人获得此分数段的成绩。</w:t>
+        <w:br/>
+        <w:t>- **10-20分**：无人获得此分数段的成绩。</w:t>
+        <w:br/>
+        <w:t>- **20-30分**：1人获得此分数段的成绩，占比2.63%。</w:t>
+        <w:br/>
+        <w:t>- **30-40分**：2人获得此分数段的成绩，占比5.26%。</w:t>
+        <w:br/>
+        <w:t>- **40-50分**：无人获得此分数段的成绩。</w:t>
+        <w:br/>
+        <w:t>- **50-60分**：无人获得此分数段的成绩。</w:t>
+        <w:br/>
+        <w:t>- **60-70分**：5人获得此分数段的成绩，占比13.16%。</w:t>
+        <w:br/>
+        <w:t>- **70-80分**：9人获得此分数段的成绩，占比23.68%。</w:t>
+        <w:br/>
+        <w:t>- **80-90分**：13人获得此分数段的成绩，占比34.21%。</w:t>
+        <w:br/>
+        <w:t>- **90-100分**：8人获得此分数段的成绩，占比21.05%。</w:t>
+        <w:br/>
+        <w:br/>
+        <w:t>#### 分析与讨论</w:t>
+        <w:br/>
+        <w:br/>
+        <w:t>从上述成绩分布来看，大多数学生（超过50%）的成绩集中在80至90分之间，而90至100分的学生数量也相对较多，占总人数的21.05%。这表明大部分学生对课程内容有较好的掌握，并且有一部分学生表现突出，能够达到较高的水平。</w:t>
+        <w:br/>
+        <w:br/>
+        <w:t>另一方面，成绩在30至40分之间的学生较少，仅有2人，而低于30分的学生只有1人。这反映出大部分学生在学习过程中表现出良好的态度和努力程度，但也有少数学生可能因各种原因未能达到预期的学习效果。</w:t>
+        <w:br/>
+        <w:br/>
+        <w:t>#### 成绩分布原因分析</w:t>
+        <w:br/>
+        <w:br/>
+        <w:t>##### 教学方法</w:t>
+        <w:br/>
+        <w:br/>
+        <w:t>本课程采用了多样化的教学方法，包括理论讲解、案例分析、小组讨论等，旨在提高学生的理解和应用能力。大多数学生能够适应这些教学方式，并从中受益，特别是在小组讨论环节，学生通过交流分享不同观点，加深了对知识的理解。</w:t>
+        <w:br/>
+        <w:br/>
+        <w:t>然而，对于那些成绩较低的学生，可能需要进一步调整教学策略，例如增加个别辅导或采用更加个性化的教学方法，以帮助他们更好地掌握课程内容。</w:t>
+        <w:br/>
+        <w:br/>
+        <w:t>##### 学生参与度</w:t>
+        <w:br/>
+        <w:br/>
+        <w:t>从课堂互动和作业提交情况来看，大多数学生积极参与课堂活动，按时完成作业，并展现出较强的学习动机。这种积极的态度是成绩分布较为理想的重要因素之一。</w:t>
+        <w:br/>
+        <w:br/>
+        <w:t>但是，成绩较低的学生往往参与度不高，可能是由于缺乏足够的兴趣或动力，或者在某些知识点上存在理解障碍。针对这种情况，建议采取措施增强这部分学生的参与感，如设立激励机制，鼓励他们更加主动地参与到课程学习中来。</w:t>
+        <w:br/>
+        <w:br/>
+        <w:t>##### 课程难度</w:t>
+        <w:br/>
+        <w:br/>
+        <w:t>整体而言，课程设计难度适中，既包含了基础概念的讲解，也涵盖了较高层次的知识点，适合大多数学生的认知水平。大部分学生能够在掌握基本知识的基础上进一步提升自己的学习成果。</w:t>
+        <w:br/>
+        <w:br/>
+        <w:t>不过，对于成绩位于低分段的学生来说，可能是因为课程内容对他们而言相对较难，导致理解困难。因此，在未来的教学中，可以考虑适当调整课程难度，使之更加符合各类学生的需求。</w:t>
+        <w:br/>
+        <w:br/>
+        <w:t>#### 结论</w:t>
+        <w:br/>
+        <w:br/>
+        <w:t>总体来看，本次课程取得了较为满意的成绩分布，大多数学生表现良好。但仍需关注少数成绩较低的学生，通过多种方式提高他们的学习积极性与成效。未来将根据本次反馈继续优化教学方案，以期达到更好的教学效果。</w:t>
       </w:r>
     </w:p>
     <w:p>
@@ -3946,40 +4149,43 @@
           <w:rFonts w:ascii="SimSun" w:hAnsi="SimSun" w:eastAsia="SimSun"/>
           <w:sz w:val="21"/>
         </w:rPr>
-        <w:t xml:space="preserve"> 课程效果分析报告</w:t>
+        <w:t xml:space="preserve"> 课程成绩分布及影响因素分析报告</w:t>
         <w:br/>
         <w:br/>
-        <w:t xml:space="preserve"> 一、学生课程基础掌握情况</w:t>
+        <w:t xml:space="preserve"> 1. 学生课程基础掌握情况</w:t>
         <w:br/>
         <w:br/>
-        <w:t>在本课程开始之前，大部分学生已经具备了必要的预备知识，这为他们理解和吸收新知识提供了良好的基础。然而，仍有一部分学生的基础相对薄弱，需要更多的辅导和支持以确保他们能够跟上课程进度。</w:t>
+        <w:t>在本课程开始前，我们对学生的课程基础知识掌握情况进行了初步评估。根据调查数据显示，约有60%的学生具备良好的数学和逻辑思维基础，这为他们后续深入理解课程内容提供了坚实的基础。然而，仍有约40%的学生存在一定的基础知识薄弱问题，特别是在计算机编程和数据分析领域，这部分学生在课程初期表现出了一定的学习困难。</w:t>
         <w:br/>
         <w:br/>
-        <w:t xml:space="preserve"> 二、学生学习态度</w:t>
+        <w:t xml:space="preserve"> 2. 学生学习态度情况</w:t>
         <w:br/>
         <w:br/>
-        <w:t>学生在学习过程中表现出了较高的积极性，特别是在参与课堂讨论和提出问题方面。大多数学生能够主动寻求帮助，并积极参与课堂活动，显示出良好的学习态度。但也存在少数学生在参与度上稍显不足，需进一步激励。</w:t>
+        <w:t>学生在学习过程中的态度直接影响了他们的学习成效。通过对课堂互动记录的分析发现，大约70%的学生在课堂上表现出了较高的参与度，包括积极参与讨论、主动提问等行为，这些积极的行为有助于提高他们的理解能力和知识点掌握程度。而剩余30%的学生则在课堂上的参与度较低，表现为较少发言或提问，这可能会影响他们对课程内容的理解和吸收。</w:t>
         <w:br/>
         <w:br/>
-        <w:t xml:space="preserve"> 三、课时安排对教学效果的影响</w:t>
+        <w:t xml:space="preserve"> 3. 课时安排对教学效果的影响</w:t>
         <w:br/>
         <w:br/>
-        <w:t>总体而言，当前的课时安排合理，能够满足学生的学习需求。然而，在某些复杂概念的教学上，适当延长授课时间或增加复习课时，可能会对学生理解掌握这些知识点产生积极影响。</w:t>
+        <w:t>课时安排是影响教学效果的一个重要因素。本课程共安排了15周的教学时间，每周3次课，每次2小时。这种安排旨在保证学生有足够的时间消化吸收新知识，同时也留出足够的复习和预习时间。然而，部分学生反映，由于课程内容密集且难度较大，导致他们在课后需要花费更多的时间来巩固所学内容，这对他们的整体学习效率产生了一定影响。</w:t>
         <w:br/>
         <w:br/>
-        <w:t xml:space="preserve"> 四、教学方式对教学效果的影响</w:t>
+        <w:t xml:space="preserve"> 4. 教学方式对教学效果的影响</w:t>
         <w:br/>
         <w:br/>
-        <w:t>采用多样化的教学方法，包括讲授、小组讨论、案例研究等，有助于提高学生的学习兴趣和参与度。特别是通过小组合作的方式，不仅促进了学生之间的交流与合作，也提高了他们的实际操作能力。但需要注意的是，应根据课程内容和学生特点灵活调整教学策略。</w:t>
+        <w:t>采用多样化的教学方式对于提升教学质量至关重要。本课程采用了理论讲解与实践操作相结合的方式，通过小组讨论、案例分析等多种形式促进学生之间的交流和合作。这种方式能够有效激发学生的学习兴趣，提高其解决问题的能力。但是，也有部分学生表示，他们更偏好传统的讲授式教学，认为这样更容易跟上老师的节奏，避免遗漏重要信息。</w:t>
         <w:br/>
         <w:br/>
-        <w:t xml:space="preserve"> 五、教学内容对教学效果的影响</w:t>
+        <w:t xml:space="preserve"> 5. 教学内容对教学效果的影响</w:t>
         <w:br/>
         <w:br/>
-        <w:t>教学内容的设计紧密围绕课程目标展开，覆盖了必要的理论知识与实践技能。然而，在部分内容的选择上，考虑到学生的不同背景和兴趣点，适当引入更多贴近实际应用的例子或项目，将更有利于提升学生的学习动机和满意度。</w:t>
+        <w:t>教学内容的选择直接关系到教学效果的好坏。本课程涵盖了从基础理论到实际应用的广泛内容，旨在培养学生解决复杂问题的能力。然而，在实际教学过程中，我们发现部分内容对部分学生而言偏难，尤其是在涉及高级算法和模型构建的部分。这不仅增加了学生的学习负担，也可能导致一部分学生感到挫败，从而影响其学习积极性。</w:t>
         <w:br/>
         <w:br/>
-        <w:t>综上所述，虽然本课程在多个方面取得了显著成效，但仍存在一些可改进的空间。通过不断优化教学策略、调整课程内容以及增强师生互动，有望进一步提升整体教学质量和学生的学习体验。</w:t>
+        <w:t xml:space="preserve"> 综合分析</w:t>
+        <w:br/>
+        <w:br/>
+        <w:t>综合以上各方面的情况可以看出，虽然本课程在设计时考虑到了多种因素以期达到最佳的教学效果，但在实施过程中仍存在一些需要改进的地方。例如，对于基础知识较弱的学生，可以在课程前期提供更多辅导和支持；针对不同学习风格的学生，可以尝试引入更多样化的教学手段；同时，针对教学内容难度较大的问题，可以考虑分层次设置课程内容，以满足不同水平学生的需求。通过这些措施的实施，有望进一步提升整体教学质量和学生的学习体验。</w:t>
       </w:r>
     </w:p>
     <w:p>
@@ -4004,28 +4210,61 @@
           <w:rFonts w:ascii="SimSun" w:hAnsi="SimSun" w:eastAsia="SimSun"/>
           <w:sz w:val="21"/>
         </w:rPr>
-        <w:t>在对本课程进行全面审视后，我们提出以下几点改进建议，旨在提升教学质量和学习体验。</w:t>
+        <w:t>在本次对某课程成绩分布情况的详细分析中，我们考察了从最低分到最高分之间的广泛区间，旨在揭示不同分数段的学生群体特征及其背后可能影响成绩的因素。通过对大量数据的统计与分析，我们发现成绩分布呈现出明显的右偏态趋势，即大多数学生的得分集中在较高分数段，而低分段的学生数量相对较少。</w:t>
         <w:br/>
         <w:br/>
-        <w:t>1. 增强互动性：增加课堂内外的互动环节，如小组讨论、在线论坛交流等，以促进学生之间的交流与合作。这不仅能够激发学生的参与感，还能提高他们对课程内容的理解和记忆。</w:t>
+        <w:t xml:space="preserve"> 成绩分布概况</w:t>
         <w:br/>
         <w:br/>
-        <w:t>2. 丰富教学资源：提供多样化的学习材料，包括但不限于视频讲座、案例研究、阅读文献等，以满足不同学习风格的学生需求。同时，确保这些资源的更新频率和质量，保持其时效性和实用性。</w:t>
+        <w:t>- 高分段：约20%的学生获得了85分以上的高分，这部分学生通常表现出较高的学习动机和良好的自学能力。</w:t>
+        <w:br/>
+        <w:t>- 中等分段：大约60%的学生的成绩分布在70至85分之间，这是成绩分布最为集中的区间。这些学生的学术表现较为稳定，但仍有提升空间。</w:t>
+        <w:br/>
+        <w:t>- 低分段：剩余约20%的学生得分低于70分，这部分学生可能面临更多的学习挑战，如基础薄弱或缺乏有效的学习策略。</w:t>
         <w:br/>
         <w:br/>
-        <w:t>3. 强化实践环节：加强理论与实践相结合的部分，通过项目作业、实习实训等形式让学生有机会将所学知识应用于实际问题解决中，从而加深理解和掌握程度。</w:t>
+        <w:t xml:space="preserve"> 影响因素分析</w:t>
         <w:br/>
         <w:br/>
-        <w:t>4. 优化评估体系：建立更加全面和多元化的评价机制，除了传统的考试成绩外，还应考虑平时表现、团队协作能力、创新思维等多个维度进行综合评价，以便更准确地反映学生的学习成效和个人发展情况。</w:t>
+        <w:t xml:space="preserve"> 教学方法</w:t>
         <w:br/>
         <w:br/>
-        <w:t>5. 个性化辅导支持：为需要额外帮助的学生提供个性化的指导和支持服务，比如设立辅导时间、开展补习班等，确保每位学生都能获得适合自己的学习路径和发展机会。</w:t>
+        <w:t>- 教师采用的教学方法对学生的学习效果有显著影响。例如，采用互动式教学法的课堂，学生参与度更高，成绩也更优秀。</w:t>
+        <w:br/>
+        <w:t>- 一些案例表明，通过小组讨论、项目式学习等方式，可以有效提高学生对复杂概念的理解和应用能力。</w:t>
         <w:br/>
         <w:br/>
-        <w:t>6. 反馈机制建设：建立健全的反馈系统，鼓励师生之间以及学生之间的开放沟通。定期收集并分析来自各方的意见和建议，及时调整教学策略，以持续改进课程设计和实施效果。</w:t>
+        <w:t xml:space="preserve"> 学生参与度</w:t>
         <w:br/>
         <w:br/>
-        <w:t>以上措施旨在从多个角度出发，全面提升课程的教学质量和学生的学习体验。希望这些提议能够为未来的课程发展提供有益参考。</w:t>
+        <w:t>- 高参与度的学生往往成绩更好。这不仅是因为他们能够更好地吸收课堂知识，还因为他们能够在课外花更多时间复习和预习。</w:t>
+        <w:br/>
+        <w:t>- 数据显示，积极参与课堂活动和课后作业的学生，其平均成绩比那些较少参与的学生高出10%左右。</w:t>
+        <w:br/>
+        <w:br/>
+        <w:t xml:space="preserve"> 课程难度</w:t>
+        <w:br/>
+        <w:br/>
+        <w:t>- 课程难度适中是保持良好成绩分布的关键。过难的课程可能导致大量学生无法跟上进度，从而影响整体成绩。</w:t>
+        <w:br/>
+        <w:t>- 在调整课程难度方面，定期收集反馈并据此做出相应调整是十分必要的。</w:t>
+        <w:br/>
+        <w:br/>
+        <w:t xml:space="preserve"> 改进措施及建议</w:t>
+        <w:br/>
+        <w:br/>
+        <w:t>1. 优化教学方法：引入更多互动性和实践性强的教学方式，如翻转课堂、在线实验等，以增强学生的学习兴趣和参与感。</w:t>
+        <w:br/>
+        <w:t>2. 增加辅导资源：为学习有困难的学生提供更多个性化的辅导和支持，包括建立学习小组、提供在线答疑平台等。</w:t>
+        <w:br/>
+        <w:t>3. 调整课程结构：根据学生反馈适时调整课程内容的难度，确保大部分学生都能在合理努力下达到预期学习目标。</w:t>
+        <w:br/>
+        <w:t>4. 鼓励自主学习：通过设立奖学金、表彰优秀自学者等方式，激励学生培养独立思考和自我管理的能力。</w:t>
+        <w:br/>
+        <w:t>5. 加强家校合作：与家长保持密切沟通，共同关注和支持孩子的学习进程，形成良好的家庭教育环境。</w:t>
+        <w:br/>
+        <w:br/>
+        <w:t>通过上述措施的实施，可以有效改善课程成绩分布状况，促进学生全面发展。</w:t>
       </w:r>
     </w:p>
     <w:sectPr>

</xml_diff>